<commit_message>
Upgrade classifier with MobileNetV3 ONNX pipeline
</commit_message>
<xml_diff>
--- a/output/docx/MLOps_Assignment_2_Report_Editable.docx
+++ b/output/docx/MLOps_Assignment_2_Report_Editable.docx
@@ -388,9 +388,9 @@
                 <w:color w:val="263238"/>
                 <w:sz w:val="18"/>
               </w:rPr>
-              <w:t>HOG + color</w:t>
+              <w:t>MobileNetV3</w:t>
               <w:br/>
-              <w:t>Random forest</w:t>
+              <w:t>ONNX + LR</w:t>
             </w:r>
           </w:p>
         </w:tc>
@@ -893,7 +893,7 @@
                 <w:color w:val="263238"/>
                 <w:sz w:val="18"/>
               </w:rPr>
-              <w:t>20 August 2026</w:t>
+              <w:t>30 August 2026</w:t>
             </w:r>
           </w:p>
         </w:tc>
@@ -920,7 +920,7 @@
     </w:p>
     <w:p>
       <w:r>
-        <w:t>This project implements all five assignment modules as one executable repository. A balanced 600-image sample from the Microsoft/Kaggle Cats-vs-Dogs collection is downloaded through a public mirror with per-image SHA-256 provenance. DVC creates deterministic 80/10/10 splits and runs training, while MLflow records parameters, metrics, the serialized model, the confusion matrix, sample requests, and learning curves.</w:t>
+        <w:t>This project implements all five assignment modules as one executable repository. A balanced 600-image sample from the Microsoft/Kaggle Cats-vs-Dogs collection is downloaded through a public mirror with per-image SHA-256 provenance. DVC creates deterministic 80/10/10 splits and runs training, while MLflow records parameters, metrics, the ONNX-backed model, the confusion matrix, candidate search, model comparison, and sample requests.</w:t>
       </w:r>
     </w:p>
     <w:p>
@@ -944,7 +944,7 @@
           <w:color w:val="152238"/>
           <w:sz w:val="21"/>
         </w:rPr>
-        <w:t>Verified result: 70% test accuracy, 0.719 F1, and 5/5 automated tests passing.</w:t>
+        <w:t>Verified result: 98% test accuracy, 0.983 F1, +28.33 points over baseline, and 6/6 automated tests passing.</w:t>
       </w:r>
     </w:p>
     <w:p>
@@ -2090,7 +2090,7 @@
                 <w:color w:val="263238"/>
                 <w:sz w:val="18"/>
               </w:rPr>
-              <w:t>Random forest</w:t>
+              <w:t>MobileNetV3 + LR</w:t>
             </w:r>
           </w:p>
         </w:tc>
@@ -2126,7 +2126,7 @@
                 <w:color w:val="263238"/>
                 <w:sz w:val="18"/>
               </w:rPr>
-              <w:t>Fast laptop baseline with class probabilities.</w:t>
+              <w:t>Pretrained visual features with a regularized head.</w:t>
             </w:r>
           </w:p>
         </w:tc>
@@ -2383,7 +2383,7 @@
     </w:p>
     <w:p>
       <w:r>
-        <w:t>Git versions all source and configuration files. DVC defines two dependency-aware stages: prepare and train. The lock file captures hashes for code, data, parameters, processed output, metrics, history, and the trained model. A local DVC remote is configured for offline reproducibility and can be replaced with S3 or another remote without changing the pipeline.</w:t>
+        <w:t>Git versions all source and configuration files. DVC defines two dependency-aware stages: prepare and train. The lock file captures hashes for code, data, parameters, processed output, metrics, history, and the signed model manifest. A local DVC remote is configured for offline reproducibility and can be replaced with S3 or another remote without changing the pipeline.</w:t>
       </w:r>
     </w:p>
     <w:p>
@@ -3011,17 +3011,17 @@
         <w:pageBreakBefore w:val="0"/>
       </w:pPr>
       <w:r>
-        <w:t>2.3 Baseline model</w:t>
+        <w:t>2.3 Baseline, champion, and leakage-safe selection</w:t>
       </w:r>
     </w:p>
     <w:p>
       <w:r>
-        <w:t>Each image is represented by HOG-style edge descriptors, a 16×16 RGB thumbnail, and per-channel color histograms. A 300-tree random forest is grown in 12 increments to produce learning curves. Original-only and augmented candidates score 0.733 and 0.667 validation accuracy respectively, so the original-only candidate is selected without consulting the test set.</w:t>
+        <w:t>The HOG/color 300-tree random forest is preserved as a 70.0% baseline. The champion freezes an ImageNet-pretrained MobileNetV3-Small extractor and maps images to 576-dimensional embeddings, reusing robust visual features without fitting a deep network to only 480 images.</w:t>
       </w:r>
     </w:p>
     <w:p>
       <w:r>
-        <w:t>The probability-enabled joblib bundle stores feature settings, class names, model version, and evaluation metadata. Deterministic flips can expand 480 training images to 960 samples without contaminating validation or test data.</w:t>
+        <w:t>Twelve candidates compare logistic regression, linear SVC, and RBF SVC across original and horizontal-flip representations. Selection uses validation accuracy only, with lower log loss as the tie-breaker. Logistic regression (C=0.1) on original images won at 98.33%. It was retrained on 540 train+validation images before one final test. The ONNX extractor SHA-256 is verified at load.</w:t>
       </w:r>
     </w:p>
     <w:p>
@@ -3046,7 +3046,7 @@
           <w:color w:val="263238"/>
           <w:sz w:val="22"/>
         </w:rPr>
-        <w:t>Experiment: cats-vs-dogs-baseline; run: random-forest-hog-baseline.</w:t>
+        <w:t>Experiment: cats-vs-dogs-model-development; baseline reference and champion runs.</w:t>
       </w:r>
     </w:p>
     <w:p>
@@ -3062,7 +3062,7 @@
           <w:color w:val="263238"/>
           <w:sz w:val="22"/>
         </w:rPr>
-        <w:t>Parameters: feature size, histogram bins, epochs, trees per epoch, max features, and seed.</w:t>
+        <w:t>Parameters: backbone, pretrained weights, candidate grid, augmentation, C, and seed.</w:t>
       </w:r>
     </w:p>
     <w:p>
@@ -3094,7 +3094,7 @@
           <w:color w:val="263238"/>
           <w:sz w:val="22"/>
         </w:rPr>
-        <w:t>Artifacts: model.joblib, metrics JSON, confusion matrix, CSV history, curves, and labeled requests.</w:t>
+        <w:t>Artifacts: model bundle, ONNX graph, manifest, candidate table, comparison plot, confusion matrix, and requests.</w:t>
       </w:r>
     </w:p>
     <w:p>
@@ -3306,7 +3306,7 @@
                 <w:color w:val="263238"/>
                 <w:sz w:val="18"/>
               </w:rPr>
-              <w:t>0.700</w:t>
+              <w:t>0.983</w:t>
             </w:r>
           </w:p>
         </w:tc>
@@ -3419,7 +3419,7 @@
                 <w:color w:val="263238"/>
                 <w:sz w:val="18"/>
               </w:rPr>
-              <w:t>0.676</w:t>
+              <w:t>1.000</w:t>
             </w:r>
           </w:p>
         </w:tc>
@@ -3532,7 +3532,7 @@
                 <w:color w:val="263238"/>
                 <w:sz w:val="18"/>
               </w:rPr>
-              <w:t>0.767</w:t>
+              <w:t>0.967</w:t>
             </w:r>
           </w:p>
         </w:tc>
@@ -3645,7 +3645,7 @@
                 <w:color w:val="263238"/>
                 <w:sz w:val="18"/>
               </w:rPr>
-              <w:t>0.719</w:t>
+              <w:t>0.983</w:t>
             </w:r>
           </w:p>
         </w:tc>
@@ -3758,7 +3758,7 @@
                 <w:color w:val="263238"/>
                 <w:sz w:val="18"/>
               </w:rPr>
-              <w:t>0.620</w:t>
+              <w:t>0.032</w:t>
             </w:r>
           </w:p>
         </w:tc>
@@ -4014,7 +4014,7 @@
                 <w:color w:val="263238"/>
                 <w:sz w:val="18"/>
               </w:rPr>
-              <w:t>19</w:t>
+              <w:t>30</w:t>
             </w:r>
           </w:p>
         </w:tc>
@@ -4050,7 +4050,7 @@
                 <w:color w:val="263238"/>
                 <w:sz w:val="18"/>
               </w:rPr>
-              <w:t>11</w:t>
+              <w:t>0</w:t>
             </w:r>
           </w:p>
         </w:tc>
@@ -4127,7 +4127,7 @@
                 <w:color w:val="263238"/>
                 <w:sz w:val="18"/>
               </w:rPr>
-              <w:t>7</w:t>
+              <w:t>1</w:t>
             </w:r>
           </w:p>
         </w:tc>
@@ -4163,7 +4163,7 @@
                 <w:color w:val="263238"/>
                 <w:sz w:val="18"/>
               </w:rPr>
-              <w:t>23</w:t>
+              <w:t>29</w:t>
             </w:r>
           </w:p>
         </w:tc>
@@ -4182,8 +4182,8 @@
       <w:r>
         <w:drawing>
           <wp:inline xmlns:a="http://schemas.openxmlformats.org/drawingml/2006/main" xmlns:pic="http://schemas.openxmlformats.org/drawingml/2006/picture">
-            <wp:extent cx="5623560" cy="2249424"/>
-            <wp:docPr id="1" name="Training and validation learning curves" descr="Two charts showing training and validation loss and accuracy as the random forest grows from 25 to 300 trees."/>
+            <wp:extent cx="5623560" cy="2108835"/>
+            <wp:docPr id="1" name="Baseline and champion model comparison" descr="Held-out accuracy and F1 comparison between the random-forest baseline and MobileNetV3 champion."/>
             <wp:cNvGraphicFramePr>
               <a:graphicFrameLocks noChangeAspect="1"/>
             </wp:cNvGraphicFramePr>
@@ -4191,7 +4191,7 @@
               <a:graphicData uri="http://schemas.openxmlformats.org/drawingml/2006/picture">
                 <pic:pic>
                   <pic:nvPicPr>
-                    <pic:cNvPr id="0" name="training_curves.png"/>
+                    <pic:cNvPr id="0" name="model_comparison.png"/>
                     <pic:cNvPicPr/>
                   </pic:nvPicPr>
                   <pic:blipFill>
@@ -4203,7 +4203,7 @@
                   <pic:spPr>
                     <a:xfrm>
                       <a:off x="0" y="0"/>
-                      <a:ext cx="5623560" cy="2249424"/>
+                      <a:ext cx="5623560" cy="2108835"/>
                     </a:xfrm>
                     <a:prstGeom prst="rect"/>
                   </pic:spPr>
@@ -4219,7 +4219,7 @@
         <w:pStyle w:val="FigureCaption"/>
       </w:pPr>
       <w:r>
-        <w:t>Figure 1. Training and validation loss/accuracy as the forest grows from 25 to 300 trees. The gap indicates expected overfitting for a deliberately small baseline dataset.</w:t>
+        <w:t>Figure 1. Held-out comparison of the preserved random-forest baseline and MobileNetV3 champion. Accuracy rises from 70.00% to 98.33%, a 28.33 percentage-point gain.</w:t>
       </w:r>
     </w:p>
     <w:p>
@@ -4888,7 +4888,7 @@
           <w:color w:val="E6EDF3"/>
           <w:sz w:val="16"/>
         </w:rPr>
-        <w:t xml:space="preserve">  "confidence": 0.5267,</w:t>
+        <w:t xml:space="preserve">  "confidence": 0.9821,</w:t>
       </w:r>
       <w:r>
         <w:br/>
@@ -4899,7 +4899,7 @@
           <w:color w:val="E6EDF3"/>
           <w:sz w:val="16"/>
         </w:rPr>
-        <w:t xml:space="preserve">  "probabilities": {"cat": 0.4733, "dog": 0.5267},</w:t>
+        <w:t xml:space="preserve">  "probabilities": {"cat": 0.0179, "dog": 0.9821},</w:t>
       </w:r>
       <w:r>
         <w:br/>
@@ -4910,7 +4910,7 @@
           <w:color w:val="E6EDF3"/>
           <w:sz w:val="16"/>
         </w:rPr>
-        <w:t xml:space="preserve">  "model_version": "1.0.0"</w:t>
+        <w:t xml:space="preserve">  "model_version": "2.0.0"</w:t>
       </w:r>
       <w:r>
         <w:br/>
@@ -4935,7 +4935,7 @@
     </w:p>
     <w:p>
       <w:r>
-        <w:t>Production and development dependencies are fully pinned. The package uses a src layout and declares Python 3.11+. The service validates content type, file size, and decoded image content, then executes exactly the same feature path used during training.</w:t>
+        <w:t>Production and development dependencies are fully pinned. The package uses a src layout and declares Python 3.11+. The service validates content type, file size, and decoded image content, then executes the exported ONNX feature graph used during training. PyTorch remains a separate training dependency and is not required by the production image.</w:t>
       </w:r>
     </w:p>
     <w:p>
@@ -5008,7 +5008,7 @@
           <w:color w:val="263238"/>
           <w:sz w:val="22"/>
         </w:rPr>
-        <w:t>Copies the versioned model artifact into a fixed, environment-overridable path.</w:t>
+        <w:t>Copies the checksum-verified joblib classifier and ONNX feature extractor into fixed paths.</w:t>
       </w:r>
     </w:p>
     <w:p>
@@ -5507,7 +5507,7 @@
                 <w:color w:val="263238"/>
                 <w:sz w:val="18"/>
               </w:rPr>
-              <w:t>Five pytest unit/API tests</w:t>
+              <w:t>Six pytest unit/API/ONNX tests</w:t>
             </w:r>
           </w:p>
         </w:tc>
@@ -5984,6 +5984,22 @@
     </w:p>
     <w:p>
       <w:pPr>
+        <w:numPr>
+          <w:ilvl w:val="0"/>
+          <w:numId w:val="10"/>
+        </w:numPr>
+      </w:pPr>
+      <w:r>
+        <w:rPr>
+          <w:rFonts w:ascii="Calibri" w:hAnsi="Calibri"/>
+          <w:color w:val="263238"/>
+          <w:sz w:val="22"/>
+        </w:rPr>
+        <w:t>ONNX backend, SHA-256, embedding size, and probability contract.</w:t>
+      </w:r>
+    </w:p>
+    <w:p>
+      <w:pPr>
         <w:pStyle w:val="CodeBlock"/>
         <w:keepLines/>
         <w:shd w:fill="0D1117"/>
@@ -6008,7 +6024,7 @@
           <w:color w:val="E6EDF3"/>
           <w:sz w:val="16"/>
         </w:rPr>
-        <w:t>.....  [100%]</w:t>
+        <w:t>......  [100%]</w:t>
       </w:r>
       <w:r>
         <w:br/>
@@ -6019,7 +6035,7 @@
           <w:color w:val="E6EDF3"/>
           <w:sz w:val="16"/>
         </w:rPr>
-        <w:t>5 passed in 1.96s</w:t>
+        <w:t>6 passed</w:t>
       </w:r>
     </w:p>
     <w:p>
@@ -6748,7 +6764,7 @@
     <w:p>
       <w:pPr>
         <w:pStyle w:val="Heading1"/>
-        <w:pageBreakBefore/>
+        <w:pageBreakBefore w:val="0"/>
       </w:pPr>
       <w:r>
         <w:t>7. M5 — Monitoring, Logging, and Performance</w:t>
@@ -7652,7 +7668,7 @@
                 <w:color w:val="263238"/>
                 <w:sz w:val="18"/>
               </w:rPr>
-              <w:t>Model artifact</w:t>
+              <w:t>Model artifacts</w:t>
             </w:r>
           </w:p>
         </w:tc>
@@ -7688,7 +7704,7 @@
                 <w:color w:val="263238"/>
                 <w:sz w:val="18"/>
               </w:rPr>
-              <w:t>models/model.joblib, 516 KB</w:t>
+              <w:t>joblib 19 KB + ONNX 3.5 MB; hashes verified</w:t>
             </w:r>
           </w:p>
         </w:tc>
@@ -7914,7 +7930,7 @@
                 <w:color w:val="263238"/>
                 <w:sz w:val="18"/>
               </w:rPr>
-              <w:t>5 passed, 0 warnings</w:t>
+              <w:t>6 passed, 0 warnings</w:t>
             </w:r>
           </w:p>
         </w:tc>
@@ -8330,7 +8346,7 @@
                 <w:color w:val="263238"/>
                 <w:sz w:val="18"/>
               </w:rPr>
-              <w:t>Container pull</w:t>
+              <w:t>Model gain</w:t>
             </w:r>
           </w:p>
         </w:tc>
@@ -8366,7 +8382,7 @@
                 <w:color w:val="263238"/>
                 <w:sz w:val="18"/>
               </w:rPr>
-              <w:t>Docker Hub base-image access required</w:t>
+              <w:t>+28.33 percentage points over baseline</w:t>
             </w:r>
           </w:p>
         </w:tc>
@@ -8402,7 +8418,7 @@
                 <w:color w:val="263238"/>
                 <w:sz w:val="18"/>
               </w:rPr>
-              <w:t>Environment dependent</w:t>
+              <w:t>PASS</w:t>
             </w:r>
           </w:p>
         </w:tc>
@@ -8468,7 +8484,7 @@
           <w:color w:val="E6EDF3"/>
           <w:sz w:val="16"/>
         </w:rPr>
-        <w:t>pip install -r requirements.txt -r requirements-dev.txt</w:t>
+        <w:t>pip install -r requirements.txt -r requirements-dev.txt -r requirements-train.txt</w:t>
       </w:r>
       <w:r>
         <w:br/>
@@ -9242,7 +9258,7 @@
     </w:p>
     <w:p>
       <w:r>
-        <w:t>This is a deliberately lightweight baseline trained on 600 images, not a production pet recognition model. Accuracy should be improved through transfer learning (for example, MobileNet or ResNet), a larger stratified dataset, augmentation, calibration, and model fairness checks. The CI/CD configuration is complete but requires repository secrets, a GHCR namespace, and an external Compose host to execute the production deployment path.</w:t>
+        <w:t>The transfer-learning champion is strong on the fixed 60-image test split, but the 600-image teaching sample is not sufficient evidence for production. Promotion should require a larger external test set, source and breed slices, calibration monitoring, drift analysis, and fairness checks. The CI/CD configuration is complete but requires repository secrets, a GHCR namespace, and an external Compose host to execute the production deployment path.</w:t>
       </w:r>
     </w:p>
     <w:p>

</xml_diff>

<commit_message>
Add MLflow and FastAPI evidence to editable report
</commit_message>
<xml_diff>
--- a/output/docx/MLOps_Assignment_2_Report_Editable.docx
+++ b/output/docx/MLOps_Assignment_2_Report_Editable.docx
@@ -3099,6 +3099,54 @@
     </w:p>
     <w:p>
       <w:pPr>
+        <w:keepLines/>
+        <w:jc w:val="center"/>
+      </w:pPr>
+      <w:r>
+        <w:drawing>
+          <wp:inline xmlns:a="http://schemas.openxmlformats.org/drawingml/2006/main" xmlns:pic="http://schemas.openxmlformats.org/drawingml/2006/picture">
+            <wp:extent cx="4434840" cy="4153669"/>
+            <wp:docPr id="1" name="MLflow champion metrics" descr="MLflow champion run showing 0.983 test F1, 0.983 test accuracy, 1.0 precision, and a 0.283 accuracy gain over baseline."/>
+            <wp:cNvGraphicFramePr>
+              <a:graphicFrameLocks noChangeAspect="1"/>
+            </wp:cNvGraphicFramePr>
+            <a:graphic>
+              <a:graphicData uri="http://schemas.openxmlformats.org/drawingml/2006/picture">
+                <pic:pic>
+                  <pic:nvPicPr>
+                    <pic:cNvPr id="0" name="mlflow_champion_metrics_report.png"/>
+                    <pic:cNvPicPr/>
+                  </pic:nvPicPr>
+                  <pic:blipFill>
+                    <a:blip r:embed="rId13"/>
+                    <a:stretch>
+                      <a:fillRect/>
+                    </a:stretch>
+                  </pic:blipFill>
+                  <pic:spPr>
+                    <a:xfrm>
+                      <a:off x="0" y="0"/>
+                      <a:ext cx="4434840" cy="4153669"/>
+                    </a:xfrm>
+                    <a:prstGeom prst="rect"/>
+                  </pic:spPr>
+                </pic:pic>
+              </a:graphicData>
+            </a:graphic>
+          </wp:inline>
+        </w:drawing>
+      </w:r>
+    </w:p>
+    <w:p>
+      <w:pPr>
+        <w:pStyle w:val="FigureCaption"/>
+      </w:pPr>
+      <w:r>
+        <w:t>Figure 1. MLflow evidence from the final MobileNetV3 champion run. The tracked metrics show 0.983 accuracy/F1, 1.000 precision, 0.032 log loss, and the 0.283 gain over baseline.</w:t>
+      </w:r>
+    </w:p>
+    <w:p>
+      <w:pPr>
         <w:pStyle w:val="Heading1"/>
         <w:pageBreakBefore/>
       </w:pPr>
@@ -4183,7 +4231,7 @@
         <w:drawing>
           <wp:inline xmlns:a="http://schemas.openxmlformats.org/drawingml/2006/main" xmlns:pic="http://schemas.openxmlformats.org/drawingml/2006/picture">
             <wp:extent cx="5623560" cy="2108835"/>
-            <wp:docPr id="1" name="Baseline and champion model comparison" descr="Held-out accuracy and F1 comparison between the random-forest baseline and MobileNetV3 champion."/>
+            <wp:docPr id="2" name="Baseline and champion model comparison" descr="Held-out accuracy and F1 comparison between the random-forest baseline and MobileNetV3 champion."/>
             <wp:cNvGraphicFramePr>
               <a:graphicFrameLocks noChangeAspect="1"/>
             </wp:cNvGraphicFramePr>
@@ -4195,7 +4243,7 @@
                     <pic:cNvPicPr/>
                   </pic:nvPicPr>
                   <pic:blipFill>
-                    <a:blip r:embed="rId13"/>
+                    <a:blip r:embed="rId14"/>
                     <a:stretch>
                       <a:fillRect/>
                     </a:stretch>
@@ -4219,7 +4267,7 @@
         <w:pStyle w:val="FigureCaption"/>
       </w:pPr>
       <w:r>
-        <w:t>Figure 1. Held-out comparison of the preserved random-forest baseline and MobileNetV3 champion. Accuracy rises from 70.00% to 98.33%, a 28.33 percentage-point gain.</w:t>
+        <w:t>Figure 2. Held-out comparison of the preserved random-forest baseline and MobileNetV3 champion. Accuracy rises from 70.00% to 98.33%, a 28.33 percentage-point gain.</w:t>
       </w:r>
     </w:p>
     <w:p>
@@ -4922,6 +4970,54 @@
           <w:sz w:val="16"/>
         </w:rPr>
         <w:t>}</w:t>
+      </w:r>
+    </w:p>
+    <w:p>
+      <w:pPr>
+        <w:keepLines/>
+        <w:jc w:val="center"/>
+      </w:pPr>
+      <w:r>
+        <w:drawing>
+          <wp:inline xmlns:a="http://schemas.openxmlformats.org/drawingml/2006/main" xmlns:pic="http://schemas.openxmlformats.org/drawingml/2006/picture">
+            <wp:extent cx="5623560" cy="3163252"/>
+            <wp:docPr id="3" name="FastAPI OpenAPI interface" descr="Live FastAPI 2.0.0 OpenAPI page showing health and prediction endpoints."/>
+            <wp:cNvGraphicFramePr>
+              <a:graphicFrameLocks noChangeAspect="1"/>
+            </wp:cNvGraphicFramePr>
+            <a:graphic>
+              <a:graphicData uri="http://schemas.openxmlformats.org/drawingml/2006/picture">
+                <pic:pic>
+                  <pic:nvPicPr>
+                    <pic:cNvPr id="0" name="fastapi_openapi_v2.png"/>
+                    <pic:cNvPicPr/>
+                  </pic:nvPicPr>
+                  <pic:blipFill>
+                    <a:blip r:embed="rId15"/>
+                    <a:stretch>
+                      <a:fillRect/>
+                    </a:stretch>
+                  </pic:blipFill>
+                  <pic:spPr>
+                    <a:xfrm>
+                      <a:off x="0" y="0"/>
+                      <a:ext cx="5623560" cy="3163252"/>
+                    </a:xfrm>
+                    <a:prstGeom prst="rect"/>
+                  </pic:spPr>
+                </pic:pic>
+              </a:graphicData>
+            </a:graphic>
+          </wp:inline>
+        </w:drawing>
+      </w:r>
+    </w:p>
+    <w:p>
+      <w:pPr>
+        <w:pStyle w:val="FigureCaption"/>
+      </w:pPr>
+      <w:r>
+        <w:t>Figure 3. Live OpenAPI evidence for service version 2.0.0, exposing the health and multipart image prediction contracts.</w:t>
       </w:r>
     </w:p>
     <w:p>
@@ -9284,7 +9380,7 @@
           <w:sz w:val="22"/>
         </w:rPr>
       </w:r>
-      <w:hyperlink r:id="rId14">
+      <w:hyperlink r:id="rId16">
         <w:r>
           <w:rPr>
             <w:color w:val="176B87"/>
@@ -9308,7 +9404,7 @@
           <w:sz w:val="22"/>
         </w:rPr>
       </w:r>
-      <w:hyperlink r:id="rId15">
+      <w:hyperlink r:id="rId17">
         <w:r>
           <w:rPr>
             <w:color w:val="176B87"/>
@@ -9332,7 +9428,7 @@
           <w:sz w:val="22"/>
         </w:rPr>
       </w:r>
-      <w:hyperlink r:id="rId16">
+      <w:hyperlink r:id="rId18">
         <w:r>
           <w:rPr>
             <w:color w:val="176B87"/>
@@ -9356,7 +9452,7 @@
           <w:sz w:val="22"/>
         </w:rPr>
       </w:r>
-      <w:hyperlink r:id="rId17">
+      <w:hyperlink r:id="rId19">
         <w:r>
           <w:rPr>
             <w:color w:val="176B87"/>
@@ -9380,7 +9476,7 @@
           <w:sz w:val="22"/>
         </w:rPr>
       </w:r>
-      <w:hyperlink r:id="rId18">
+      <w:hyperlink r:id="rId20">
         <w:r>
           <w:rPr>
             <w:color w:val="176B87"/>
@@ -9404,7 +9500,7 @@
           <w:sz w:val="22"/>
         </w:rPr>
       </w:r>
-      <w:hyperlink r:id="rId19">
+      <w:hyperlink r:id="rId21">
         <w:r>
           <w:rPr>
             <w:color w:val="176B87"/>
@@ -9428,7 +9524,7 @@
           <w:sz w:val="22"/>
         </w:rPr>
       </w:r>
-      <w:hyperlink r:id="rId20">
+      <w:hyperlink r:id="rId22">
         <w:r>
           <w:rPr>
             <w:color w:val="176B87"/>

</xml_diff>